<commit_message>
Update medical history with TMJ/occlusion timeline and current symptoms.
</commit_message>
<xml_diff>
--- a/medical_history/medical_history.docx
+++ b/medical_history/medical_history.docx
@@ -4,68 +4,39 @@
   <w:body>
     <w:p>
       <w:pPr>
+        <w:spacing w:lineRule="auto" w:line="324" w:after="240" w:before="0"/>
         <w:jc w:val="center"/>
       </w:pPr>
       <w:r>
         <w:rPr>
-          <w:rFonts w:ascii="Microsoft YaHei" w:hAnsi="Microsoft YaHei" w:eastAsia="微软雅黑"/>
+          <w:rFonts w:ascii="微软雅黑" w:hAnsi="微软雅黑" w:eastAsia="微软雅黑"/>
           <w:b/>
-          <w:color w:val="2C5282"/>
-          <w:sz w:val="36"/>
+          <w:sz w:val="32"/>
         </w:rPr>
         <w:t>我的病史记录</w:t>
       </w:r>
     </w:p>
     <w:p>
       <w:pPr>
-        <w:jc w:val="center"/>
+        <w:spacing w:lineRule="auto" w:line="324" w:after="80" w:before="0"/>
       </w:pPr>
       <w:r>
         <w:rPr>
-          <w:rFonts w:ascii="Microsoft YaHei" w:hAnsi="Microsoft YaHei" w:eastAsia="微软雅黑"/>
+          <w:rFonts w:ascii="微软雅黑" w:hAnsi="微软雅黑" w:eastAsia="微软雅黑"/>
           <w:b/>
-          <w:color w:val="4A5568"/>
-          <w:sz w:val="24"/>
+          <w:sz w:val="22"/>
         </w:rPr>
-        <w:t>左侧颞下颌关节 / 咬合相关问题</w:t>
+        <w:t>医生您好，我主要是左侧颞下颌关节以及咬合方面的问题。之前看过其他医生，医生建议我来找您进一步评估咬合情况。</w:t>
       </w:r>
     </w:p>
     <w:p>
       <w:pPr>
-        <w:spacing w:before="280" w:after="120"/>
+        <w:spacing w:lineRule="auto" w:line="324" w:after="160" w:before="0"/>
       </w:pPr>
       <w:r>
         <w:rPr>
-          <w:rFonts w:ascii="Microsoft YaHei" w:hAnsi="Microsoft YaHei" w:eastAsia="微软雅黑"/>
+          <w:rFonts w:ascii="微软雅黑" w:hAnsi="微软雅黑" w:eastAsia="微软雅黑"/>
           <w:b/>
-          <w:color w:val="2D3748"/>
-          <w:sz w:val="28"/>
-        </w:rPr>
-        <w:t>一、向医生叙述</w:t>
-      </w:r>
-    </w:p>
-    <w:p>
-      <w:pPr>
-        <w:spacing w:after="80" w:line="324" w:lineRule="auto"/>
-      </w:pPr>
-      <w:r>
-        <w:rPr>
-          <w:rFonts w:ascii="Microsoft YaHei" w:hAnsi="Microsoft YaHei" w:eastAsia="微软雅黑"/>
-          <w:b w:val="0"/>
-          <w:sz w:val="22"/>
-        </w:rPr>
-        <w:t>医生您好，我主要是左侧颞下颌关节以及咬合方面的问题。之前看过康复科治疗颞下颌关节的医生，医生建议进一步评估咬合情况。</w:t>
-      </w:r>
-    </w:p>
-    <w:p>
-      <w:pPr>
-        <w:spacing w:before="200" w:after="80"/>
-      </w:pPr>
-      <w:r>
-        <w:rPr>
-          <w:rFonts w:ascii="Microsoft YaHei" w:hAnsi="Microsoft YaHei" w:eastAsia="微软雅黑"/>
-          <w:b/>
-          <w:color w:val="2C5282"/>
           <w:sz w:val="24"/>
         </w:rPr>
         <w:t>病程时间线</w:t>
@@ -73,315 +44,257 @@
     </w:p>
     <w:p>
       <w:pPr>
-        <w:spacing w:after="80" w:line="324" w:lineRule="auto"/>
+        <w:spacing w:lineRule="auto" w:line="324" w:after="80" w:before="0"/>
       </w:pPr>
       <w:r>
         <w:rPr>
-          <w:rFonts w:ascii="Microsoft YaHei" w:hAnsi="Microsoft YaHei" w:eastAsia="微软雅黑"/>
+          <w:rFonts w:ascii="微软雅黑" w:hAnsi="微软雅黑" w:eastAsia="微软雅黑"/>
           <w:b/>
           <w:sz w:val="22"/>
         </w:rPr>
-        <w:t>约90天前</w:t>
-      </w:r>
-    </w:p>
-    <w:p>
-      <w:pPr>
-        <w:spacing w:after="80" w:line="324" w:lineRule="auto"/>
-      </w:pPr>
-      <w:r>
-        <w:rPr>
-          <w:rFonts w:ascii="Microsoft YaHei" w:hAnsi="Microsoft YaHei" w:eastAsia="微软雅黑"/>
-          <w:b w:val="0"/>
-          <w:sz w:val="22"/>
-        </w:rPr>
-        <w:t>我补了左下6、7号牙。补牙后感觉左侧牙齿接触比以前高一些。之后出现左下半排牙酸胀、发麻，持续数天，咬棉签时感觉会有所缓解。随后感觉对应上牙也出现疼痛不适。</w:t>
-      </w:r>
-    </w:p>
-    <w:p>
-      <w:pPr>
-        <w:spacing w:after="80" w:line="324" w:lineRule="auto"/>
-      </w:pPr>
-      <w:r>
-        <w:rPr>
-          <w:rFonts w:ascii="Microsoft YaHei" w:hAnsi="Microsoft YaHei" w:eastAsia="微软雅黑"/>
-          <w:b/>
-          <w:sz w:val="22"/>
-        </w:rPr>
-        <w:t>约70天前</w:t>
-      </w:r>
-    </w:p>
-    <w:p>
-      <w:pPr>
-        <w:spacing w:after="80" w:line="324" w:lineRule="auto"/>
-      </w:pPr>
-      <w:r>
-        <w:rPr>
-          <w:rFonts w:ascii="Microsoft YaHei" w:hAnsi="Microsoft YaHei" w:eastAsia="微软雅黑"/>
-          <w:b w:val="0"/>
-          <w:sz w:val="22"/>
-        </w:rPr>
-        <w:t>我进行过一次调磨。调磨后感觉闭嘴咬合方式发生变化：</w:t>
+        <w:t>约90天前（补牙）</w:t>
       </w:r>
     </w:p>
     <w:p>
       <w:pPr>
         <w:pStyle w:val="ListBullet"/>
-        <w:spacing w:after="40" w:line="312" w:lineRule="auto"/>
-        <w:ind w:left="425"/>
+        <w:spacing w:lineRule="auto" w:line="324" w:after="80" w:before="0"/>
       </w:pPr>
       <w:r>
         <w:rPr>
-          <w:rFonts w:ascii="Microsoft YaHei" w:hAnsi="Microsoft YaHei" w:eastAsia="微软雅黑"/>
+          <w:rFonts w:ascii="微软雅黑" w:hAnsi="微软雅黑" w:eastAsia="微软雅黑"/>
           <w:b w:val="0"/>
           <w:sz w:val="22"/>
         </w:rPr>
-        <w:t>有时闭合过程中会先出现滑动，然后左前牙接触；</w:t>
+        <w:t>补了左下6、7号牙</w:t>
       </w:r>
     </w:p>
     <w:p>
       <w:pPr>
         <w:pStyle w:val="ListBullet"/>
-        <w:spacing w:after="40" w:line="312" w:lineRule="auto"/>
-        <w:ind w:left="425"/>
+        <w:spacing w:lineRule="auto" w:line="324" w:after="80" w:before="0"/>
       </w:pPr>
       <w:r>
         <w:rPr>
-          <w:rFonts w:ascii="Microsoft YaHei" w:hAnsi="Microsoft YaHei" w:eastAsia="微软雅黑"/>
-          <w:b w:val="0"/>
-          <w:sz w:val="22"/>
-        </w:rPr>
-        <w:t>有时会直接感觉左前牙先接触。</w:t>
-      </w:r>
-    </w:p>
-    <w:p>
-      <w:pPr>
-        <w:spacing w:after="80" w:line="324" w:lineRule="auto"/>
-      </w:pPr>
-      <w:r>
-        <w:rPr>
-          <w:rFonts w:ascii="Microsoft YaHei" w:hAnsi="Microsoft YaHei" w:eastAsia="微软雅黑"/>
-          <w:b w:val="0"/>
-          <w:sz w:val="22"/>
-        </w:rPr>
-        <w:t>之后逐渐出现左侧下巴刺痛、面部不适，以及舌头左侧出现较明显牙印。</w:t>
-      </w:r>
-    </w:p>
-    <w:p>
-      <w:pPr>
-        <w:spacing w:after="80" w:line="324" w:lineRule="auto"/>
-      </w:pPr>
-      <w:r>
-        <w:rPr>
-          <w:rFonts w:ascii="Microsoft YaHei" w:hAnsi="Microsoft YaHei" w:eastAsia="微软雅黑"/>
+          <w:rFonts w:ascii="微软雅黑" w:hAnsi="微软雅黑" w:eastAsia="微软雅黑"/>
           <w:b/>
           <w:sz w:val="22"/>
         </w:rPr>
-        <w:t>约50天前</w:t>
-      </w:r>
-    </w:p>
-    <w:p>
-      <w:pPr>
-        <w:spacing w:after="80" w:line="324" w:lineRule="auto"/>
-      </w:pPr>
-      <w:r>
-        <w:rPr>
-          <w:rFonts w:ascii="Microsoft YaHei" w:hAnsi="Microsoft YaHei" w:eastAsia="微软雅黑"/>
-          <w:b w:val="0"/>
-          <w:sz w:val="22"/>
-        </w:rPr>
-        <w:t>开始出现明显关节症状。</w:t>
-      </w:r>
-    </w:p>
-    <w:p>
-      <w:pPr>
-        <w:spacing w:after="80" w:line="324" w:lineRule="auto"/>
-      </w:pPr>
-      <w:r>
-        <w:rPr>
-          <w:rFonts w:ascii="Microsoft YaHei" w:hAnsi="Microsoft YaHei" w:eastAsia="微软雅黑"/>
-          <w:b w:val="0"/>
-          <w:sz w:val="22"/>
-        </w:rPr>
-        <w:t>吃饭时左侧颞下颌关节出现明显弹响，基本咀嚼一下响一下。无论使用左侧还是右侧咀嚼，均会感觉左侧关节出现弹响。弹响呈连续性出现，感觉左侧关节内像有结构活动。</w:t>
-      </w:r>
-    </w:p>
-    <w:p>
-      <w:pPr>
-        <w:spacing w:after="80" w:line="324" w:lineRule="auto"/>
-      </w:pPr>
-      <w:r>
-        <w:rPr>
-          <w:rFonts w:ascii="Microsoft YaHei" w:hAnsi="Microsoft YaHei" w:eastAsia="微软雅黑"/>
-          <w:b w:val="0"/>
-          <w:sz w:val="22"/>
-        </w:rPr>
-        <w:t>弹响期间张口轨迹明显异常：</w:t>
+        <w:t>补后感觉左侧牙齿接触比以前高一些</w:t>
       </w:r>
     </w:p>
     <w:p>
       <w:pPr>
         <w:pStyle w:val="ListBullet"/>
-        <w:spacing w:after="40" w:line="312" w:lineRule="auto"/>
-        <w:ind w:left="425"/>
+        <w:spacing w:lineRule="auto" w:line="324" w:after="80" w:before="0"/>
       </w:pPr>
       <w:r>
         <w:rPr>
-          <w:rFonts w:ascii="Microsoft YaHei" w:hAnsi="Microsoft YaHei" w:eastAsia="微软雅黑"/>
+          <w:rFonts w:ascii="微软雅黑" w:hAnsi="微软雅黑" w:eastAsia="微软雅黑"/>
           <w:b w:val="0"/>
           <w:sz w:val="22"/>
         </w:rPr>
-        <w:t>有时张口时下颌向左侧偏移，张大后可以逐渐恢复；</w:t>
+        <w:t>出现左下半排牙酸胀麻，持续数天，咬棉签时可缓解</w:t>
       </w:r>
     </w:p>
     <w:p>
       <w:pPr>
         <w:pStyle w:val="ListBullet"/>
-        <w:spacing w:after="40" w:line="312" w:lineRule="auto"/>
-        <w:ind w:left="425"/>
+        <w:spacing w:lineRule="auto" w:line="324" w:after="80" w:before="0"/>
       </w:pPr>
       <w:r>
         <w:rPr>
-          <w:rFonts w:ascii="Microsoft YaHei" w:hAnsi="Microsoft YaHei" w:eastAsia="微软雅黑"/>
+          <w:rFonts w:ascii="微软雅黑" w:hAnsi="微软雅黑" w:eastAsia="微软雅黑"/>
           <w:b w:val="0"/>
           <w:sz w:val="22"/>
         </w:rPr>
-        <w:t>有时偏移持续存在，张大后也不能完全恢复。</w:t>
+        <w:t>随后对应上牙也出现疼痛不适</w:t>
       </w:r>
     </w:p>
     <w:p>
       <w:pPr>
-        <w:spacing w:after="80" w:line="324" w:lineRule="auto"/>
+        <w:spacing w:lineRule="auto" w:line="324" w:after="80" w:before="0"/>
       </w:pPr>
       <w:r>
         <w:rPr>
-          <w:rFonts w:ascii="Microsoft YaHei" w:hAnsi="Microsoft YaHei" w:eastAsia="微软雅黑"/>
-          <w:b w:val="0"/>
-          <w:sz w:val="22"/>
-        </w:rPr>
-        <w:t>同时出现左侧面部肌肉紧张、偶发抽动以及牙齿不自主碰撞。</w:t>
-      </w:r>
-    </w:p>
-    <w:p>
-      <w:pPr>
-        <w:spacing w:after="80" w:line="324" w:lineRule="auto"/>
-      </w:pPr>
-      <w:r>
-        <w:rPr>
-          <w:rFonts w:ascii="Microsoft YaHei" w:hAnsi="Microsoft YaHei" w:eastAsia="微软雅黑"/>
-          <w:b w:val="0"/>
-          <w:sz w:val="22"/>
-        </w:rPr>
-        <w:t>检查提示左侧颞下颌关节盘前移。之后进行了约20天流食。</w:t>
-      </w:r>
-    </w:p>
-    <w:p>
-      <w:pPr>
-        <w:spacing w:after="80" w:line="324" w:lineRule="auto"/>
-      </w:pPr>
-      <w:r>
-        <w:rPr>
-          <w:rFonts w:ascii="Microsoft YaHei" w:hAnsi="Microsoft YaHei" w:eastAsia="微软雅黑"/>
+          <w:rFonts w:ascii="微软雅黑" w:hAnsi="微软雅黑" w:eastAsia="微软雅黑"/>
           <w:b/>
           <w:sz w:val="22"/>
         </w:rPr>
-        <w:t>约30天前</w:t>
-      </w:r>
-    </w:p>
-    <w:p>
-      <w:pPr>
-        <w:spacing w:after="80" w:line="324" w:lineRule="auto"/>
-      </w:pPr>
-      <w:r>
-        <w:rPr>
-          <w:rFonts w:ascii="Microsoft YaHei" w:hAnsi="Microsoft YaHei" w:eastAsia="微软雅黑"/>
-          <w:b w:val="0"/>
-          <w:sz w:val="22"/>
-        </w:rPr>
-        <w:t>弹响次数减少，但出现张口受限。之后接受过手法复位，目前张口过程中会再次出现弹响。</w:t>
-      </w:r>
-    </w:p>
-    <w:p>
-      <w:pPr>
-        <w:spacing w:before="280" w:after="120"/>
-      </w:pPr>
-      <w:r>
-        <w:rPr>
-          <w:rFonts w:ascii="Microsoft YaHei" w:hAnsi="Microsoft YaHei" w:eastAsia="微软雅黑"/>
-          <w:b/>
-          <w:color w:val="2D3748"/>
-          <w:sz w:val="28"/>
-        </w:rPr>
-        <w:t>二、目前主要症状</w:t>
-      </w:r>
-    </w:p>
-    <w:p>
-      <w:pPr>
-        <w:spacing w:before="200" w:after="80"/>
-      </w:pPr>
-      <w:r>
-        <w:rPr>
-          <w:rFonts w:ascii="Microsoft YaHei" w:hAnsi="Microsoft YaHei" w:eastAsia="微软雅黑"/>
-          <w:b/>
-          <w:color w:val="2C5282"/>
-          <w:sz w:val="24"/>
-        </w:rPr>
-        <w:t>1. 咬合及下颌位置感觉</w:t>
+        <w:t>约70天前（调磨）</w:t>
       </w:r>
     </w:p>
     <w:p>
       <w:pPr>
         <w:pStyle w:val="ListBullet"/>
-        <w:spacing w:after="40" w:line="312" w:lineRule="auto"/>
-        <w:ind w:left="425"/>
+        <w:spacing w:lineRule="auto" w:line="324" w:after="80" w:before="0"/>
       </w:pPr>
       <w:r>
         <w:rPr>
-          <w:rFonts w:ascii="Microsoft YaHei" w:hAnsi="Microsoft YaHei" w:eastAsia="微软雅黑"/>
+          <w:rFonts w:ascii="微软雅黑" w:hAnsi="微软雅黑" w:eastAsia="微软雅黑"/>
           <w:b w:val="0"/>
           <w:sz w:val="22"/>
         </w:rPr>
-        <w:t>左侧咬纸时反而感觉比较舒服，空咬时感觉不自然或不舒服。</w:t>
+        <w:t>进行调磨；医生好像在左下6号牙咬合面沿5号牙至7号牙方向调磨过一条线</w:t>
       </w:r>
     </w:p>
     <w:p>
       <w:pPr>
         <w:pStyle w:val="ListBullet"/>
-        <w:spacing w:after="40" w:line="312" w:lineRule="auto"/>
-        <w:ind w:left="425"/>
+        <w:spacing w:lineRule="auto" w:line="324" w:after="80" w:before="0"/>
       </w:pPr>
       <w:r>
         <w:rPr>
-          <w:rFonts w:ascii="Microsoft YaHei" w:hAnsi="Microsoft YaHei" w:eastAsia="微软雅黑"/>
-          <w:b w:val="0"/>
+          <w:rFonts w:ascii="微软雅黑" w:hAnsi="微软雅黑" w:eastAsia="微软雅黑"/>
+          <w:b/>
           <w:sz w:val="22"/>
         </w:rPr>
-        <w:t>发病后感觉下颌位置与以前不同，静止闭口时有下巴后缩感。</w:t>
+        <w:t>闭嘴咬合方式变化：闭合过程中有时先滑动再左前牙接触，有时直接左前牙先接触</w:t>
       </w:r>
     </w:p>
     <w:p>
       <w:pPr>
         <w:pStyle w:val="ListBullet"/>
-        <w:spacing w:after="40" w:line="312" w:lineRule="auto"/>
-        <w:ind w:left="425"/>
+        <w:spacing w:lineRule="auto" w:line="324" w:after="80" w:before="0"/>
       </w:pPr>
       <w:r>
         <w:rPr>
-          <w:rFonts w:ascii="Microsoft YaHei" w:hAnsi="Microsoft YaHei" w:eastAsia="微软雅黑"/>
+          <w:rFonts w:ascii="微软雅黑" w:hAnsi="微软雅黑" w:eastAsia="微软雅黑"/>
           <w:b w:val="0"/>
           <w:sz w:val="22"/>
         </w:rPr>
-        <w:t>下颌前伸时，左侧感觉有一块区域无法充分接触，像空出来一块。</w:t>
+        <w:t>逐渐出现左侧下颌刺痛，舌头左侧有较明显牙印</w:t>
+      </w:r>
+    </w:p>
+    <w:p>
+      <w:pPr>
+        <w:spacing w:lineRule="auto" w:line="324" w:after="80" w:before="0"/>
+      </w:pPr>
+      <w:r>
+        <w:rPr>
+          <w:rFonts w:ascii="微软雅黑" w:hAnsi="微软雅黑" w:eastAsia="微软雅黑"/>
+          <w:b/>
+          <w:sz w:val="22"/>
+        </w:rPr>
+        <w:t>约50天前（关节问题出现）</w:t>
       </w:r>
     </w:p>
     <w:p>
       <w:pPr>
         <w:pStyle w:val="ListBullet"/>
-        <w:spacing w:after="40" w:line="312" w:lineRule="auto"/>
-        <w:ind w:left="425"/>
+        <w:spacing w:lineRule="auto" w:line="324" w:after="80" w:before="0"/>
       </w:pPr>
       <w:r>
         <w:rPr>
-          <w:rFonts w:ascii="Microsoft YaHei" w:hAnsi="Microsoft YaHei" w:eastAsia="微软雅黑"/>
+          <w:rFonts w:ascii="微软雅黑" w:hAnsi="微软雅黑" w:eastAsia="微软雅黑"/>
+          <w:b/>
+          <w:sz w:val="22"/>
+        </w:rPr>
+        <w:t>吃饭时左侧颞下颌关节明显弹响，基本咀嚼一下响一下；左右侧咀嚼均左侧关节弹响；之后约20天流食</w:t>
+      </w:r>
+    </w:p>
+    <w:p>
+      <w:pPr>
+        <w:pStyle w:val="ListBullet"/>
+        <w:spacing w:lineRule="auto" w:line="324" w:after="80" w:before="0"/>
+      </w:pPr>
+      <w:r>
+        <w:rPr>
+          <w:rFonts w:ascii="微软雅黑" w:hAnsi="微软雅黑" w:eastAsia="微软雅黑"/>
+          <w:b w:val="0"/>
+          <w:sz w:val="22"/>
+        </w:rPr>
+        <w:t>左侧脸内像有东西滑动、左侧面部偶发抽动、牙齿不自主碰撞</w:t>
+      </w:r>
+    </w:p>
+    <w:p>
+      <w:pPr>
+        <w:pStyle w:val="ListBullet"/>
+        <w:spacing w:lineRule="auto" w:line="324" w:after="80" w:before="0"/>
+      </w:pPr>
+      <w:r>
+        <w:rPr>
+          <w:rFonts w:ascii="微软雅黑" w:hAnsi="微软雅黑" w:eastAsia="微软雅黑"/>
+          <w:b/>
+          <w:sz w:val="22"/>
+        </w:rPr>
+        <w:t>检查提示左侧颞下颌关节盘前移</w:t>
+      </w:r>
+    </w:p>
+    <w:p>
+      <w:pPr>
+        <w:spacing w:lineRule="auto" w:line="324" w:after="80" w:before="0"/>
+      </w:pPr>
+      <w:r>
+        <w:rPr>
+          <w:rFonts w:ascii="微软雅黑" w:hAnsi="微软雅黑" w:eastAsia="微软雅黑"/>
+          <w:b/>
+          <w:sz w:val="22"/>
+        </w:rPr>
+        <w:t>约30天前（复位治疗）</w:t>
+      </w:r>
+    </w:p>
+    <w:p>
+      <w:pPr>
+        <w:pStyle w:val="ListBullet"/>
+        <w:spacing w:lineRule="auto" w:line="324" w:after="80" w:before="0"/>
+      </w:pPr>
+      <w:r>
+        <w:rPr>
+          <w:rFonts w:ascii="微软雅黑" w:hAnsi="微软雅黑" w:eastAsia="微软雅黑"/>
+          <w:b/>
+          <w:sz w:val="22"/>
+        </w:rPr>
+        <w:t>弹响次数减少，出现张口受限约2指，张口轨迹偏斜，用手托住两侧脸张嘴偏斜消失</w:t>
+      </w:r>
+    </w:p>
+    <w:p>
+      <w:pPr>
+        <w:pStyle w:val="ListBullet"/>
+        <w:spacing w:lineRule="auto" w:line="324" w:after="80" w:before="0"/>
+      </w:pPr>
+      <w:r>
+        <w:rPr>
+          <w:rFonts w:ascii="微软雅黑" w:hAnsi="微软雅黑" w:eastAsia="微软雅黑"/>
+          <w:b/>
+          <w:sz w:val="22"/>
+        </w:rPr>
+        <w:t>接受手法复位，变成张口弹响</w:t>
+      </w:r>
+    </w:p>
+    <w:p>
+      <w:pPr>
+        <w:spacing w:lineRule="auto" w:line="324" w:after="160" w:before="0"/>
+      </w:pPr>
+      <w:r>
+        <w:rPr>
+          <w:rFonts w:ascii="微软雅黑" w:hAnsi="微软雅黑" w:eastAsia="微软雅黑"/>
+          <w:b/>
+          <w:sz w:val="24"/>
+        </w:rPr>
+        <w:t>目前主要症状</w:t>
+      </w:r>
+    </w:p>
+    <w:p>
+      <w:pPr>
+        <w:spacing w:lineRule="auto" w:line="324" w:after="80" w:before="0"/>
+      </w:pPr>
+      <w:r>
+        <w:rPr>
+          <w:rFonts w:ascii="微软雅黑" w:hAnsi="微软雅黑" w:eastAsia="微软雅黑"/>
+          <w:b/>
+          <w:sz w:val="22"/>
+        </w:rPr>
+        <w:t>一、咬合及下颌位置感觉</w:t>
+      </w:r>
+    </w:p>
+    <w:p>
+      <w:pPr>
+        <w:spacing w:lineRule="auto" w:line="324" w:after="80" w:before="0"/>
+      </w:pPr>
+      <w:r>
+        <w:rPr>
+          <w:rFonts w:ascii="微软雅黑" w:hAnsi="微软雅黑" w:eastAsia="微软雅黑"/>
           <w:b w:val="0"/>
           <w:sz w:val="22"/>
         </w:rPr>
@@ -390,13 +303,11 @@
     </w:p>
     <w:p>
       <w:pPr>
-        <w:pStyle w:val="ListBullet"/>
-        <w:spacing w:after="40" w:line="312" w:lineRule="auto"/>
-        <w:ind w:left="425"/>
+        <w:spacing w:lineRule="auto" w:line="324" w:after="80" w:before="0"/>
       </w:pPr>
       <w:r>
         <w:rPr>
-          <w:rFonts w:ascii="Microsoft YaHei" w:hAnsi="Microsoft YaHei" w:eastAsia="微软雅黑"/>
+          <w:rFonts w:ascii="微软雅黑" w:hAnsi="微软雅黑" w:eastAsia="微软雅黑"/>
           <w:b w:val="0"/>
           <w:sz w:val="22"/>
         </w:rPr>
@@ -405,25 +316,37 @@
     </w:p>
     <w:p>
       <w:pPr>
-        <w:spacing w:before="200" w:after="80"/>
+        <w:spacing w:lineRule="auto" w:line="324" w:after="80" w:before="0"/>
       </w:pPr>
       <w:r>
         <w:rPr>
-          <w:rFonts w:ascii="Microsoft YaHei" w:hAnsi="Microsoft YaHei" w:eastAsia="微软雅黑"/>
+          <w:rFonts w:ascii="微软雅黑" w:hAnsi="微软雅黑" w:eastAsia="微软雅黑"/>
           <w:b/>
-          <w:color w:val="2C5282"/>
-          <w:sz w:val="24"/>
+          <w:sz w:val="22"/>
         </w:rPr>
-        <w:t>2. 不同咬合位置对张口功能的影响</w:t>
+        <w:t>左侧经常感觉有一块区域无法充分接触，像空出来一块，下巴后缩就没这种感觉了。</w:t>
       </w:r>
     </w:p>
     <w:p>
       <w:pPr>
-        <w:spacing w:after="80" w:line="324" w:lineRule="auto"/>
+        <w:spacing w:lineRule="auto" w:line="324" w:after="80" w:before="0"/>
       </w:pPr>
       <w:r>
         <w:rPr>
-          <w:rFonts w:ascii="Microsoft YaHei" w:hAnsi="Microsoft YaHei" w:eastAsia="微软雅黑"/>
+          <w:rFonts w:ascii="微软雅黑" w:hAnsi="微软雅黑" w:eastAsia="微软雅黑"/>
+          <w:b/>
+          <w:sz w:val="22"/>
+        </w:rPr>
+        <w:t>二、不同咬合位置对张口功能的影响</w:t>
+      </w:r>
+    </w:p>
+    <w:p>
+      <w:pPr>
+        <w:spacing w:lineRule="auto" w:line="324" w:after="80" w:before="0"/>
+      </w:pPr>
+      <w:r>
+        <w:rPr>
+          <w:rFonts w:ascii="微软雅黑" w:hAnsi="微软雅黑" w:eastAsia="微软雅黑"/>
           <w:b w:val="0"/>
           <w:sz w:val="22"/>
         </w:rPr>
@@ -433,84 +356,66 @@
     <w:p>
       <w:pPr>
         <w:pStyle w:val="ListBullet"/>
-        <w:spacing w:after="40" w:line="312" w:lineRule="auto"/>
-        <w:ind w:left="425"/>
+        <w:spacing w:lineRule="auto" w:line="324" w:after="80" w:before="0"/>
       </w:pPr>
       <w:r>
         <w:rPr>
-          <w:rFonts w:ascii="Microsoft YaHei" w:hAnsi="Microsoft YaHei" w:eastAsia="微软雅黑"/>
-          <w:b w:val="0"/>
+          <w:rFonts w:ascii="微软雅黑" w:hAnsi="微软雅黑" w:eastAsia="微软雅黑"/>
+          <w:b/>
           <w:sz w:val="22"/>
         </w:rPr>
-        <w:t>某个感觉比较舒服、自然的咬合位置保持一段时间后，反而容易出现张口困难；</w:t>
+        <w:t>牙齿对的比较舒服的咬合位置保持一段时间后，会出现张口受限，需要活动下颌才能再次张开；</w:t>
       </w:r>
     </w:p>
     <w:p>
       <w:pPr>
         <w:pStyle w:val="ListBullet"/>
-        <w:spacing w:after="40" w:line="312" w:lineRule="auto"/>
-        <w:ind w:left="425"/>
+        <w:spacing w:lineRule="auto" w:line="324" w:after="80" w:before="0"/>
       </w:pPr>
       <w:r>
         <w:rPr>
-          <w:rFonts w:ascii="Microsoft YaHei" w:hAnsi="Microsoft YaHei" w:eastAsia="微软雅黑"/>
-          <w:b w:val="0"/>
+          <w:rFonts w:ascii="微软雅黑" w:hAnsi="微软雅黑" w:eastAsia="微软雅黑"/>
+          <w:b/>
           <w:sz w:val="22"/>
         </w:rPr>
-        <w:t>而左前牙先接触的另一个位置（感觉并非最舒服）保持一段时间后，张口受限反而没有那么明显。</w:t>
+        <w:t>而左前牙（2或者3）先接触的位置保持一段时间后，反而不会张口受限。</w:t>
       </w:r>
     </w:p>
     <w:p>
       <w:pPr>
-        <w:spacing w:after="80" w:line="324" w:lineRule="auto"/>
+        <w:spacing w:lineRule="auto" w:line="324" w:after="80" w:before="0"/>
       </w:pPr>
       <w:r>
         <w:rPr>
-          <w:rFonts w:ascii="Microsoft YaHei" w:hAnsi="Microsoft YaHei" w:eastAsia="微软雅黑"/>
-          <w:b w:val="0"/>
+          <w:rFonts w:ascii="微软雅黑" w:hAnsi="微软雅黑" w:eastAsia="微软雅黑"/>
+          <w:b/>
           <w:sz w:val="22"/>
         </w:rPr>
-        <w:t>希望医生帮助判断：这种现象是否提示不同下颌位置对关节、肌肉功能或下颌运动存在影响。</w:t>
-      </w:r>
-    </w:p>
-    <w:p>
-      <w:pPr>
-        <w:spacing w:before="200" w:after="80"/>
-      </w:pPr>
-      <w:r>
-        <w:rPr>
-          <w:rFonts w:ascii="Microsoft YaHei" w:hAnsi="Microsoft YaHei" w:eastAsia="微软雅黑"/>
-          <w:b/>
-          <w:color w:val="2C5282"/>
-          <w:sz w:val="24"/>
-        </w:rPr>
-        <w:t>3. 张口情况</w:t>
+        <w:t>三、张口情况</w:t>
       </w:r>
     </w:p>
     <w:p>
       <w:pPr>
         <w:pStyle w:val="ListBullet"/>
-        <w:spacing w:after="40" w:line="312" w:lineRule="auto"/>
-        <w:ind w:left="425"/>
+        <w:spacing w:lineRule="auto" w:line="324" w:after="80" w:before="0"/>
       </w:pPr>
       <w:r>
         <w:rPr>
-          <w:rFonts w:ascii="Microsoft YaHei" w:hAnsi="Microsoft YaHei" w:eastAsia="微软雅黑"/>
+          <w:rFonts w:ascii="微软雅黑" w:hAnsi="微软雅黑" w:eastAsia="微软雅黑"/>
           <w:b w:val="0"/>
           <w:sz w:val="22"/>
         </w:rPr>
-        <w:t>最大张口：3指以上</w:t>
+        <w:t>最大张口：3指</w:t>
       </w:r>
     </w:p>
     <w:p>
       <w:pPr>
         <w:pStyle w:val="ListBullet"/>
-        <w:spacing w:after="40" w:line="312" w:lineRule="auto"/>
-        <w:ind w:left="425"/>
+        <w:spacing w:lineRule="auto" w:line="324" w:after="80" w:before="0"/>
       </w:pPr>
       <w:r>
         <w:rPr>
-          <w:rFonts w:ascii="Microsoft YaHei" w:hAnsi="Microsoft YaHei" w:eastAsia="微软雅黑"/>
+          <w:rFonts w:ascii="微软雅黑" w:hAnsi="微软雅黑" w:eastAsia="微软雅黑"/>
           <w:b w:val="0"/>
           <w:sz w:val="22"/>
         </w:rPr>
@@ -520,27 +425,25 @@
     <w:p>
       <w:pPr>
         <w:pStyle w:val="ListBullet"/>
-        <w:spacing w:after="40" w:line="312" w:lineRule="auto"/>
-        <w:ind w:left="425"/>
+        <w:spacing w:lineRule="auto" w:line="324" w:after="80" w:before="0"/>
       </w:pPr>
       <w:r>
         <w:rPr>
-          <w:rFonts w:ascii="Microsoft YaHei" w:hAnsi="Microsoft YaHei" w:eastAsia="微软雅黑"/>
+          <w:rFonts w:ascii="微软雅黑" w:hAnsi="微软雅黑" w:eastAsia="微软雅黑"/>
           <w:b w:val="0"/>
           <w:sz w:val="22"/>
         </w:rPr>
-        <w:t>弹响出现位置：约2.5指张口时</w:t>
+        <w:t>弹响出现位置：下颌活动或者张口末端</w:t>
       </w:r>
     </w:p>
     <w:p>
       <w:pPr>
         <w:pStyle w:val="ListBullet"/>
-        <w:spacing w:after="40" w:line="312" w:lineRule="auto"/>
-        <w:ind w:left="425"/>
+        <w:spacing w:lineRule="auto" w:line="324" w:after="80" w:before="0"/>
       </w:pPr>
       <w:r>
         <w:rPr>
-          <w:rFonts w:ascii="Microsoft YaHei" w:hAnsi="Microsoft YaHei" w:eastAsia="微软雅黑"/>
+          <w:rFonts w:ascii="微软雅黑" w:hAnsi="微软雅黑" w:eastAsia="微软雅黑"/>
           <w:b w:val="0"/>
           <w:sz w:val="22"/>
         </w:rPr>
@@ -549,174 +452,66 @@
     </w:p>
     <w:p>
       <w:pPr>
-        <w:spacing w:before="200" w:after="80"/>
+        <w:spacing w:lineRule="auto" w:line="324" w:after="80" w:before="0"/>
       </w:pPr>
       <w:r>
         <w:rPr>
-          <w:rFonts w:ascii="Microsoft YaHei" w:hAnsi="Microsoft YaHei" w:eastAsia="微软雅黑"/>
+          <w:rFonts w:ascii="微软雅黑" w:hAnsi="微软雅黑" w:eastAsia="微软雅黑"/>
           <w:b/>
-          <w:color w:val="2C5282"/>
-          <w:sz w:val="24"/>
+          <w:sz w:val="22"/>
         </w:rPr>
-        <w:t>4. 疼痛情况</w:t>
+        <w:t>四、疼痛情况</w:t>
       </w:r>
     </w:p>
     <w:p>
       <w:pPr>
         <w:pStyle w:val="ListBullet"/>
-        <w:spacing w:after="40" w:line="312" w:lineRule="auto"/>
-        <w:ind w:left="425"/>
+        <w:spacing w:lineRule="auto" w:line="324" w:after="80" w:before="0"/>
       </w:pPr>
       <w:r>
         <w:rPr>
-          <w:rFonts w:ascii="Microsoft YaHei" w:hAnsi="Microsoft YaHei" w:eastAsia="微软雅黑"/>
+          <w:rFonts w:ascii="微软雅黑" w:hAnsi="微软雅黑" w:eastAsia="微软雅黑"/>
           <w:b w:val="0"/>
           <w:sz w:val="22"/>
         </w:rPr>
-        <w:t>疼痛并非持续存在，有时明显，有时没有</w:t>
-      </w:r>
-    </w:p>
-    <w:p>
-      <w:pPr>
-        <w:spacing w:after="80" w:line="324" w:lineRule="auto"/>
-      </w:pPr>
-      <w:r>
-        <w:rPr>
-          <w:rFonts w:ascii="Microsoft YaHei" w:hAnsi="Microsoft YaHei" w:eastAsia="微软雅黑"/>
-          <w:b w:val="0"/>
-          <w:sz w:val="22"/>
-        </w:rPr>
-        <w:t>发病初期曾出现：</w:t>
+        <w:t>发病后多次出现太阳穴紧绷、面部痛、脖子痛、耳周耳朵里面痛</w:t>
       </w:r>
     </w:p>
     <w:p>
       <w:pPr>
         <w:pStyle w:val="ListBullet"/>
-        <w:spacing w:after="40" w:line="312" w:lineRule="auto"/>
-        <w:ind w:left="709"/>
+        <w:spacing w:lineRule="auto" w:line="324" w:after="80" w:before="0"/>
       </w:pPr>
       <w:r>
         <w:rPr>
-          <w:rFonts w:ascii="Microsoft YaHei" w:hAnsi="Microsoft YaHei" w:eastAsia="微软雅黑"/>
+          <w:rFonts w:ascii="微软雅黑" w:hAnsi="微软雅黑" w:eastAsia="微软雅黑"/>
           <w:b w:val="0"/>
           <w:sz w:val="22"/>
         </w:rPr>
-        <w:t>太阳穴疼痛</w:t>
+        <w:t>戴了2次磨牙垫，每次戴完之后智齿后面位置会紧绷痛几天，就不再敢带了</w:t>
+      </w:r>
+    </w:p>
+    <w:p>
+      <w:pPr>
+        <w:spacing w:lineRule="auto" w:line="324" w:after="80" w:before="0"/>
+      </w:pPr>
+      <w:r>
+        <w:rPr>
+          <w:rFonts w:ascii="微软雅黑" w:hAnsi="微软雅黑" w:eastAsia="微软雅黑"/>
+          <w:b/>
+          <w:sz w:val="22"/>
+        </w:rPr>
+        <w:t>五、其他情况</w:t>
       </w:r>
     </w:p>
     <w:p>
       <w:pPr>
         <w:pStyle w:val="ListBullet"/>
-        <w:spacing w:after="40" w:line="312" w:lineRule="auto"/>
-        <w:ind w:left="709"/>
+        <w:spacing w:lineRule="auto" w:line="324" w:after="80" w:before="0"/>
       </w:pPr>
       <w:r>
         <w:rPr>
-          <w:rFonts w:ascii="Microsoft YaHei" w:hAnsi="Microsoft YaHei" w:eastAsia="微软雅黑"/>
-          <w:b w:val="0"/>
-          <w:sz w:val="22"/>
-        </w:rPr>
-        <w:t>面部不适</w:t>
-      </w:r>
-    </w:p>
-    <w:p>
-      <w:pPr>
-        <w:pStyle w:val="ListBullet"/>
-        <w:spacing w:after="40" w:line="312" w:lineRule="auto"/>
-        <w:ind w:left="709"/>
-      </w:pPr>
-      <w:r>
-        <w:rPr>
-          <w:rFonts w:ascii="Microsoft YaHei" w:hAnsi="Microsoft YaHei" w:eastAsia="微软雅黑"/>
-          <w:b w:val="0"/>
-          <w:sz w:val="22"/>
-        </w:rPr>
-        <w:t>脖子紧张疼痛</w:t>
-      </w:r>
-    </w:p>
-    <w:p>
-      <w:pPr>
-        <w:pStyle w:val="ListBullet"/>
-        <w:spacing w:after="40" w:line="312" w:lineRule="auto"/>
-        <w:ind w:left="709"/>
-      </w:pPr>
-      <w:r>
-        <w:rPr>
-          <w:rFonts w:ascii="Microsoft YaHei" w:hAnsi="Microsoft YaHei" w:eastAsia="微软雅黑"/>
-          <w:b w:val="0"/>
-          <w:sz w:val="22"/>
-        </w:rPr>
-        <w:t>耳周不适</w:t>
-      </w:r>
-    </w:p>
-    <w:p>
-      <w:pPr>
-        <w:pStyle w:val="ListBullet"/>
-        <w:spacing w:after="40" w:line="312" w:lineRule="auto"/>
-        <w:ind w:left="425"/>
-      </w:pPr>
-      <w:r>
-        <w:rPr>
-          <w:rFonts w:ascii="Microsoft YaHei" w:hAnsi="Microsoft YaHei" w:eastAsia="微软雅黑"/>
-          <w:b w:val="0"/>
-          <w:sz w:val="22"/>
-        </w:rPr>
-        <w:t>每次发作持续几天</w:t>
-      </w:r>
-    </w:p>
-    <w:p>
-      <w:pPr>
-        <w:pStyle w:val="ListBullet"/>
-        <w:spacing w:after="40" w:line="312" w:lineRule="auto"/>
-        <w:ind w:left="425"/>
-      </w:pPr>
-      <w:r>
-        <w:rPr>
-          <w:rFonts w:ascii="Microsoft YaHei" w:hAnsi="Microsoft YaHei" w:eastAsia="微软雅黑"/>
-          <w:b w:val="0"/>
-          <w:sz w:val="22"/>
-        </w:rPr>
-        <w:t>后续偶尔出现类似症状</w:t>
-      </w:r>
-    </w:p>
-    <w:p>
-      <w:pPr>
-        <w:pStyle w:val="ListBullet"/>
-        <w:spacing w:after="40" w:line="312" w:lineRule="auto"/>
-        <w:ind w:left="425"/>
-      </w:pPr>
-      <w:r>
-        <w:rPr>
-          <w:rFonts w:ascii="Microsoft YaHei" w:hAnsi="Microsoft YaHei" w:eastAsia="微软雅黑"/>
-          <w:b w:val="0"/>
-          <w:sz w:val="22"/>
-        </w:rPr>
-        <w:t>有时候智齿后面会紧绷痛</w:t>
-      </w:r>
-    </w:p>
-    <w:p>
-      <w:pPr>
-        <w:spacing w:before="200" w:after="80"/>
-      </w:pPr>
-      <w:r>
-        <w:rPr>
-          <w:rFonts w:ascii="Microsoft YaHei" w:hAnsi="Microsoft YaHei" w:eastAsia="微软雅黑"/>
-          <w:b/>
-          <w:color w:val="2C5282"/>
-          <w:sz w:val="24"/>
-        </w:rPr>
-        <w:t>5. 其他情况</w:t>
-      </w:r>
-    </w:p>
-    <w:p>
-      <w:pPr>
-        <w:pStyle w:val="ListBullet"/>
-        <w:spacing w:after="40" w:line="312" w:lineRule="auto"/>
-        <w:ind w:left="425"/>
-      </w:pPr>
-      <w:r>
-        <w:rPr>
-          <w:rFonts w:ascii="Microsoft YaHei" w:hAnsi="Microsoft YaHei" w:eastAsia="微软雅黑"/>
+          <w:rFonts w:ascii="微软雅黑" w:hAnsi="微软雅黑" w:eastAsia="微软雅黑"/>
           <w:b w:val="0"/>
           <w:sz w:val="22"/>
         </w:rPr>
@@ -726,27 +521,25 @@
     <w:p>
       <w:pPr>
         <w:pStyle w:val="ListBullet"/>
-        <w:spacing w:after="40" w:line="312" w:lineRule="auto"/>
-        <w:ind w:left="425"/>
+        <w:spacing w:lineRule="auto" w:line="324" w:after="80" w:before="0"/>
       </w:pPr>
       <w:r>
         <w:rPr>
-          <w:rFonts w:ascii="Microsoft YaHei" w:hAnsi="Microsoft YaHei" w:eastAsia="微软雅黑"/>
+          <w:rFonts w:ascii="微软雅黑" w:hAnsi="微软雅黑" w:eastAsia="微软雅黑"/>
           <w:b w:val="0"/>
           <w:sz w:val="22"/>
         </w:rPr>
-        <w:t>补牙之前咬合一直正常，没有明显关节或肌肉问题</w:t>
+        <w:t>补牙之前咬合一直正常，没有关节或肌肉问题</w:t>
       </w:r>
     </w:p>
     <w:p>
       <w:pPr>
         <w:pStyle w:val="ListBullet"/>
-        <w:spacing w:after="40" w:line="312" w:lineRule="auto"/>
-        <w:ind w:left="425"/>
+        <w:spacing w:lineRule="auto" w:line="324" w:after="80" w:before="0"/>
       </w:pPr>
       <w:r>
         <w:rPr>
-          <w:rFonts w:ascii="Microsoft YaHei" w:hAnsi="Microsoft YaHei" w:eastAsia="微软雅黑"/>
+          <w:rFonts w:ascii="微软雅黑" w:hAnsi="微软雅黑" w:eastAsia="微软雅黑"/>
           <w:b w:val="0"/>
           <w:sz w:val="22"/>
         </w:rPr>
@@ -755,321 +548,138 @@
     </w:p>
     <w:p>
       <w:pPr>
-        <w:spacing w:before="280" w:after="120"/>
+        <w:spacing w:lineRule="auto" w:line="324" w:after="160" w:before="0"/>
       </w:pPr>
       <w:r>
         <w:rPr>
-          <w:rFonts w:ascii="Microsoft YaHei" w:hAnsi="Microsoft YaHei" w:eastAsia="微软雅黑"/>
+          <w:rFonts w:ascii="微软雅黑" w:hAnsi="微软雅黑" w:eastAsia="微软雅黑"/>
           <w:b/>
-          <w:color w:val="2D3748"/>
-          <w:sz w:val="28"/>
+          <w:sz w:val="24"/>
         </w:rPr>
-        <w:t>三、已有检查结果</w:t>
+        <w:t>希望医生重点评估的问题</w:t>
       </w:r>
     </w:p>
     <w:p>
       <w:pPr>
-        <w:pStyle w:val="ListBullet"/>
-        <w:spacing w:after="40" w:line="312" w:lineRule="auto"/>
-        <w:ind w:left="425"/>
+        <w:spacing w:lineRule="auto" w:line="324" w:after="80" w:before="0"/>
       </w:pPr>
       <w:r>
         <w:rPr>
-          <w:rFonts w:ascii="Microsoft YaHei" w:hAnsi="Microsoft YaHei" w:eastAsia="微软雅黑"/>
-          <w:b w:val="0"/>
+          <w:rFonts w:ascii="微软雅黑" w:hAnsi="微软雅黑" w:eastAsia="微软雅黑"/>
+          <w:b/>
           <w:sz w:val="22"/>
         </w:rPr>
-        <w:t>影像检查提示：左侧颞下颌关节盘前移</w:t>
+        <w:t>1. 目前症状的主要影响因素是什么？</w:t>
       </w:r>
     </w:p>
     <w:p>
       <w:pPr>
-        <w:pStyle w:val="ListBullet"/>
-        <w:spacing w:after="40" w:line="312" w:lineRule="auto"/>
-        <w:ind w:left="425"/>
+        <w:spacing w:lineRule="auto" w:line="324" w:after="80" w:before="0"/>
       </w:pPr>
       <w:r>
         <w:rPr>
-          <w:rFonts w:ascii="Microsoft YaHei" w:hAnsi="Microsoft YaHei" w:eastAsia="微软雅黑"/>
+          <w:rFonts w:ascii="微软雅黑" w:hAnsi="微软雅黑" w:eastAsia="微软雅黑"/>
           <w:b w:val="0"/>
           <w:sz w:val="22"/>
         </w:rPr>
-        <w:t>携带影像资料供参考</w:t>
+        <w:t>希望评估以下因素中，哪一项占主要作用：关节盘位置及关节结构变化、咀嚼肌功能及肌肉紧张、咬合接触变化或功能性干扰</w:t>
       </w:r>
     </w:p>
     <w:p>
       <w:pPr>
-        <w:spacing w:before="280" w:after="120"/>
+        <w:spacing w:lineRule="auto" w:line="324" w:after="80" w:before="0"/>
       </w:pPr>
       <w:r>
         <w:rPr>
-          <w:rFonts w:ascii="Microsoft YaHei" w:hAnsi="Microsoft YaHei" w:eastAsia="微软雅黑"/>
+          <w:rFonts w:ascii="微软雅黑" w:hAnsi="微软雅黑" w:eastAsia="微软雅黑"/>
           <w:b/>
-          <w:color w:val="2D3748"/>
-          <w:sz w:val="28"/>
+          <w:sz w:val="22"/>
         </w:rPr>
-        <w:t>四、希望医生重点评估的问题</w:t>
+        <w:t>2. 补牙及后续调磨后的咬合变化是否影响了下颌运动？</w:t>
       </w:r>
     </w:p>
     <w:p>
       <w:pPr>
-        <w:spacing w:after="80" w:line="324" w:lineRule="auto"/>
+        <w:spacing w:lineRule="auto" w:line="324" w:after="80" w:before="0"/>
       </w:pPr>
       <w:r>
         <w:rPr>
-          <w:rFonts w:ascii="Microsoft YaHei" w:hAnsi="Microsoft YaHei" w:eastAsia="微软雅黑"/>
+          <w:rFonts w:ascii="微软雅黑" w:hAnsi="微软雅黑" w:eastAsia="微软雅黑"/>
           <w:b w:val="0"/>
           <w:sz w:val="22"/>
         </w:rPr>
-        <w:t>1. 左侧关节盘前移目前属于什么状态？是否属于可复位性关节盘前移？</w:t>
+        <w:t>特别是左下6号牙调磨后，是否可能导致后牙支撑变化、下颌闭合轨迹改变？是否存在左前牙（2或3）提前接触，并与后牙支撑变化有关？</w:t>
       </w:r>
     </w:p>
     <w:p>
       <w:pPr>
-        <w:spacing w:after="80" w:line="324" w:lineRule="auto"/>
+        <w:spacing w:lineRule="auto" w:line="324" w:after="80" w:before="0"/>
       </w:pPr>
       <w:r>
         <w:rPr>
-          <w:rFonts w:ascii="Microsoft YaHei" w:hAnsi="Microsoft YaHei" w:eastAsia="微软雅黑"/>
-          <w:b w:val="0"/>
+          <w:rFonts w:ascii="微软雅黑" w:hAnsi="微软雅黑" w:eastAsia="微软雅黑"/>
+          <w:b/>
           <w:sz w:val="22"/>
         </w:rPr>
-        <w:t>2. 目前弹响、张口受限、张口偏斜等表现，主要与以下哪方面关系更大？</w:t>
+        <w:t>3. 关于咬合位置与张口受限的判断：</w:t>
       </w:r>
     </w:p>
     <w:p>
       <w:pPr>
-        <w:pStyle w:val="ListBullet"/>
-        <w:spacing w:after="40" w:line="312" w:lineRule="auto"/>
-        <w:ind w:left="425"/>
+        <w:spacing w:lineRule="auto" w:line="324" w:after="80" w:before="0"/>
       </w:pPr>
       <w:r>
         <w:rPr>
-          <w:rFonts w:ascii="Microsoft YaHei" w:hAnsi="Microsoft YaHei" w:eastAsia="微软雅黑"/>
+          <w:rFonts w:ascii="微软雅黑" w:hAnsi="微软雅黑" w:eastAsia="微软雅黑"/>
           <w:b w:val="0"/>
           <w:sz w:val="22"/>
         </w:rPr>
-        <w:t>关节盘位置变化</w:t>
+        <w:t>牙齿对得比较舒服的咬合位保持一段时间后容易张口受限；而左前牙（2或3）先接触的位置保持一段时间后反而不会受限。这一现象是否提示不同下颌位置对关节或肌肉功能存在影响？目前是否应按「功能更好」的位置调整咬合，还是建议先观察？治疗上应优先关节功能恢复、肌肉康复，还是进一步评估咬合？</w:t>
       </w:r>
     </w:p>
     <w:p>
       <w:pPr>
-        <w:pStyle w:val="ListBullet"/>
-        <w:spacing w:after="40" w:line="312" w:lineRule="auto"/>
-        <w:ind w:left="425"/>
+        <w:spacing w:lineRule="auto" w:line="324" w:after="80" w:before="0"/>
       </w:pPr>
       <w:r>
         <w:rPr>
-          <w:rFonts w:ascii="Microsoft YaHei" w:hAnsi="Microsoft YaHei" w:eastAsia="微软雅黑"/>
-          <w:b w:val="0"/>
+          <w:rFonts w:ascii="微软雅黑" w:hAnsi="微软雅黑" w:eastAsia="微软雅黑"/>
+          <w:b/>
           <w:sz w:val="22"/>
         </w:rPr>
-        <w:t>关节结构</w:t>
+        <w:t>4. 关节盘状态与咬合垫：</w:t>
       </w:r>
     </w:p>
     <w:p>
       <w:pPr>
-        <w:pStyle w:val="ListBullet"/>
-        <w:spacing w:after="40" w:line="312" w:lineRule="auto"/>
-        <w:ind w:left="425"/>
+        <w:spacing w:lineRule="auto" w:line="324" w:after="80" w:before="0"/>
       </w:pPr>
       <w:r>
         <w:rPr>
-          <w:rFonts w:ascii="Microsoft YaHei" w:hAnsi="Microsoft YaHei" w:eastAsia="微软雅黑"/>
+          <w:rFonts w:ascii="微软雅黑" w:hAnsi="微软雅黑" w:eastAsia="微软雅黑"/>
           <w:b w:val="0"/>
           <w:sz w:val="22"/>
         </w:rPr>
-        <w:t>肌肉功能</w:t>
+        <w:t>检查曾提示左侧关节盘前移，复位后变为张口弹响。目前属于什么状态（如可复位性盘前移）？弹响、张口受限与盘位置的关系如何？此前戴磨牙垫后智齿后方紧绷痛，是否仍适合使用咬合垫？</w:t>
       </w:r>
     </w:p>
     <w:p>
       <w:pPr>
-        <w:pStyle w:val="ListBullet"/>
-        <w:spacing w:after="40" w:line="312" w:lineRule="auto"/>
-        <w:ind w:left="425"/>
-      </w:pPr>
-      <w:r>
-        <w:rPr>
-          <w:rFonts w:ascii="Microsoft YaHei" w:hAnsi="Microsoft YaHei" w:eastAsia="微软雅黑"/>
-          <w:b w:val="0"/>
-          <w:sz w:val="22"/>
-        </w:rPr>
-        <w:t>咬合因素</w:t>
-      </w:r>
-    </w:p>
-    <w:p>
-      <w:pPr>
-        <w:spacing w:after="80" w:line="324" w:lineRule="auto"/>
-      </w:pPr>
-      <w:r>
-        <w:rPr>
-          <w:rFonts w:ascii="Microsoft YaHei" w:hAnsi="Microsoft YaHei" w:eastAsia="微软雅黑"/>
-          <w:b w:val="0"/>
-          <w:sz w:val="22"/>
-        </w:rPr>
-        <w:t>3. 补牙及后续调磨后出现的咬合变化，是否存在咬合接触异常或功能性干扰？</w:t>
-      </w:r>
-    </w:p>
-    <w:p>
-      <w:pPr>
-        <w:spacing w:after="80" w:line="324" w:lineRule="auto"/>
-      </w:pPr>
-      <w:r>
-        <w:rPr>
-          <w:rFonts w:ascii="Microsoft YaHei" w:hAnsi="Microsoft YaHei" w:eastAsia="微软雅黑"/>
-          <w:b w:val="0"/>
-          <w:sz w:val="22"/>
-        </w:rPr>
-        <w:t>4. 不同咬合位置持续一段时间后，会导致不同程度的张口受限。这种现象是否提示：</w:t>
-      </w:r>
-    </w:p>
-    <w:p>
-      <w:pPr>
-        <w:pStyle w:val="ListBullet"/>
-        <w:spacing w:after="40" w:line="312" w:lineRule="auto"/>
-        <w:ind w:left="425"/>
-      </w:pPr>
-      <w:r>
-        <w:rPr>
-          <w:rFonts w:ascii="Microsoft YaHei" w:hAnsi="Microsoft YaHei" w:eastAsia="微软雅黑"/>
-          <w:b w:val="0"/>
-          <w:sz w:val="22"/>
-        </w:rPr>
-        <w:t>下颌位置不同</w:t>
-      </w:r>
-    </w:p>
-    <w:p>
-      <w:pPr>
-        <w:pStyle w:val="ListBullet"/>
-        <w:spacing w:after="40" w:line="312" w:lineRule="auto"/>
-        <w:ind w:left="425"/>
-      </w:pPr>
-      <w:r>
-        <w:rPr>
-          <w:rFonts w:ascii="Microsoft YaHei" w:hAnsi="Microsoft YaHei" w:eastAsia="微软雅黑"/>
-          <w:b w:val="0"/>
-          <w:sz w:val="22"/>
-        </w:rPr>
-        <w:t>关节负荷不同</w:t>
-      </w:r>
-    </w:p>
-    <w:p>
-      <w:pPr>
-        <w:pStyle w:val="ListBullet"/>
-        <w:spacing w:after="40" w:line="312" w:lineRule="auto"/>
-        <w:ind w:left="425"/>
-      </w:pPr>
-      <w:r>
-        <w:rPr>
-          <w:rFonts w:ascii="Microsoft YaHei" w:hAnsi="Microsoft YaHei" w:eastAsia="微软雅黑"/>
-          <w:b w:val="0"/>
-          <w:sz w:val="22"/>
-        </w:rPr>
-        <w:t>肌肉状态不同</w:t>
-      </w:r>
-    </w:p>
-    <w:p>
-      <w:pPr>
-        <w:spacing w:after="80" w:line="324" w:lineRule="auto"/>
-      </w:pPr>
-      <w:r>
-        <w:rPr>
-          <w:rFonts w:ascii="Microsoft YaHei" w:hAnsi="Microsoft YaHei" w:eastAsia="微软雅黑"/>
-          <w:b w:val="0"/>
-          <w:sz w:val="22"/>
-        </w:rPr>
-        <w:t>从而影响张口功能？</w:t>
-      </w:r>
-    </w:p>
-    <w:p>
-      <w:pPr>
-        <w:spacing w:after="80" w:line="324" w:lineRule="auto"/>
-      </w:pPr>
-      <w:r>
-        <w:rPr>
-          <w:rFonts w:ascii="Microsoft YaHei" w:hAnsi="Microsoft YaHei" w:eastAsia="微软雅黑"/>
-          <w:b w:val="0"/>
-          <w:sz w:val="22"/>
-        </w:rPr>
-        <w:t>5. 当前治疗重点应该优先放在哪个方向更合适？</w:t>
-      </w:r>
-    </w:p>
-    <w:p>
-      <w:pPr>
-        <w:pStyle w:val="ListBullet"/>
-        <w:spacing w:after="40" w:line="312" w:lineRule="auto"/>
-        <w:ind w:left="425"/>
-      </w:pPr>
-      <w:r>
-        <w:rPr>
-          <w:rFonts w:ascii="Microsoft YaHei" w:hAnsi="Microsoft YaHei" w:eastAsia="微软雅黑"/>
-          <w:b w:val="0"/>
-          <w:sz w:val="22"/>
-        </w:rPr>
-        <w:t>关节功能恢复</w:t>
-      </w:r>
-    </w:p>
-    <w:p>
-      <w:pPr>
-        <w:pStyle w:val="ListBullet"/>
-        <w:spacing w:after="40" w:line="312" w:lineRule="auto"/>
-        <w:ind w:left="425"/>
-      </w:pPr>
-      <w:r>
-        <w:rPr>
-          <w:rFonts w:ascii="Microsoft YaHei" w:hAnsi="Microsoft YaHei" w:eastAsia="微软雅黑"/>
-          <w:b w:val="0"/>
-          <w:sz w:val="22"/>
-        </w:rPr>
-        <w:t>肌肉放松及康复训练</w:t>
-      </w:r>
-    </w:p>
-    <w:p>
-      <w:pPr>
-        <w:pStyle w:val="ListBullet"/>
-        <w:spacing w:after="40" w:line="312" w:lineRule="auto"/>
-        <w:ind w:left="425"/>
-      </w:pPr>
-      <w:r>
-        <w:rPr>
-          <w:rFonts w:ascii="Microsoft YaHei" w:hAnsi="Microsoft YaHei" w:eastAsia="微软雅黑"/>
-          <w:b w:val="0"/>
-          <w:sz w:val="22"/>
-        </w:rPr>
-        <w:t>咬合重新评估</w:t>
-      </w:r>
-    </w:p>
-    <w:p>
-      <w:pPr>
-        <w:spacing w:after="80" w:line="324" w:lineRule="auto"/>
-      </w:pPr>
-      <w:r>
-        <w:rPr>
-          <w:rFonts w:ascii="Microsoft YaHei" w:hAnsi="Microsoft YaHei" w:eastAsia="微软雅黑"/>
-          <w:b w:val="0"/>
-          <w:sz w:val="22"/>
-        </w:rPr>
-        <w:t>6. 如果发现某个牙齿接触状态感觉不理想，但下颌功能反而更好，是否需要调整咬合？还是应该先观察关节及肌肉恢复情况？</w:t>
-      </w:r>
-    </w:p>
-    <w:p>
-      <w:pPr>
-        <w:spacing w:before="400"/>
+        <w:spacing w:lineRule="auto" w:line="324" w:after="0" w:before="0"/>
         <w:jc w:val="center"/>
       </w:pPr>
       <w:r>
         <w:rPr>
-          <w:rFonts w:ascii="Microsoft YaHei" w:hAnsi="Microsoft YaHei" w:eastAsia="微软雅黑"/>
+          <w:rFonts w:ascii="微软雅黑" w:hAnsi="微软雅黑" w:eastAsia="微软雅黑"/>
           <w:b w:val="0"/>
-          <w:color w:val="718096"/>
-          <w:sz w:val="20"/>
+          <w:sz w:val="22"/>
         </w:rPr>
-        <w:t>最后更新：2026年7月29日</w:t>
+        <w:t>最后更新：2026年7月30日</w:t>
       </w:r>
     </w:p>
     <w:sectPr>
       <w:pgSz w:w="12240" w:h="15840"/>
-      <w:pgMar w:top="1134" w:right="1417" w:bottom="1134" w:left="1417" w:header="720" w:footer="720" w:gutter="0"/>
+      <w:pgMar w:top="1440" w:right="1440" w:bottom="1440" w:left="1440" w:header="720" w:footer="720" w:gutter="0"/>
       <w:cols w:space="720"/>
       <w:docGrid w:linePitch="360"/>
     </w:sectPr>
@@ -1440,6 +1050,13 @@
     <w:name w:val="Normal"/>
     <w:qFormat/>
     <w:rsid w:val="00FC693F"/>
+    <w:pPr>
+      <w:spacing w:lineRule="auto" w:line="324"/>
+    </w:pPr>
+    <w:rPr>
+      <w:rFonts w:ascii="微软雅黑" w:hAnsi="微软雅黑" w:eastAsia="微软雅黑"/>
+      <w:sz w:val="22"/>
+    </w:rPr>
   </w:style>
   <w:style w:type="paragraph" w:styleId="Header">
     <w:name w:val="header"/>

</xml_diff>

<commit_message>
Update medical history: temple tightness occurs almost daily
Clarify that temple tightness is nearly daily, separate from intermittent facial/neck/ear pain.

Co-authored-by: cnlyj6 <cnlyj6@users.noreply.github.com>
</commit_message>
<xml_diff>
--- a/medical_history/medical_history.docx
+++ b/medical_history/medical_history.docx
@@ -474,7 +474,21 @@
           <w:b w:val="0"/>
           <w:sz w:val="22"/>
         </w:rPr>
-        <w:t>发病后多次出现太阳穴紧绷、面部痛、脖子痛、耳周耳朵里面痛</w:t>
+        <w:t>太阳穴紧绷几乎每天都有</w:t>
+      </w:r>
+    </w:p>
+    <w:p>
+      <w:pPr>
+        <w:pStyle w:val="ListBullet"/>
+        <w:spacing w:lineRule="auto" w:line="324" w:after="80" w:before="0"/>
+      </w:pPr>
+      <w:r>
+        <w:rPr>
+          <w:rFonts w:ascii="微软雅黑" w:hAnsi="微软雅黑" w:eastAsia="微软雅黑"/>
+          <w:b w:val="0"/>
+          <w:sz w:val="22"/>
+        </w:rPr>
+        <w:t>另多次出现面部痛、脖子痛、耳周耳朵里面痛</w:t>
       </w:r>
     </w:p>
     <w:p>

</xml_diff>

<commit_message>
Clarify pain symptoms are on the left side only
Update temple, facial, neck, and ear pain wording to specify left-sided symptoms.

Co-authored-by: cnlyj6 <cnlyj6@users.noreply.github.com>
</commit_message>
<xml_diff>
--- a/medical_history/medical_history.docx
+++ b/medical_history/medical_history.docx
@@ -474,7 +474,7 @@
           <w:b w:val="0"/>
           <w:sz w:val="22"/>
         </w:rPr>
-        <w:t>太阳穴紧绷几乎每天都有</w:t>
+        <w:t>左侧太阳穴紧绷几乎每天都有</w:t>
       </w:r>
     </w:p>
     <w:p>
@@ -488,7 +488,7 @@
           <w:b w:val="0"/>
           <w:sz w:val="22"/>
         </w:rPr>
-        <w:t>另多次出现面部痛、脖子痛、耳周耳朵里面痛</w:t>
+        <w:t>另多次出现左侧面部痛、左侧脖子痛、左耳周及耳朵里面痛</w:t>
       </w:r>
     </w:p>
     <w:p>

</xml_diff>

<commit_message>
Note temple tightness in left anterior contact position
Record that the left anterior tooth contact position avoids limited opening but causes left temple tightness if held.

Co-authored-by: cnlyj6 <cnlyj6@users.noreply.github.com>
</commit_message>
<xml_diff>
--- a/medical_history/medical_history.docx
+++ b/medical_history/medical_history.docx
@@ -378,7 +378,7 @@
           <w:b/>
           <w:sz w:val="22"/>
         </w:rPr>
-        <w:t>而左前牙（2或者3）先接触的位置保持一段时间后，反而不会张口受限。</w:t>
+        <w:t>而左前牙（2或者3）先接触的位置保持一段时间后，反而不会张口受限；但是这种位置保持一会就会出现左侧太阳穴紧绷。</w:t>
       </w:r>
     </w:p>
     <w:p>
@@ -648,7 +648,7 @@
           <w:b w:val="0"/>
           <w:sz w:val="22"/>
         </w:rPr>
-        <w:t>牙齿对得比较舒服的咬合位保持一段时间后容易张口受限；而左前牙（2或3）先接触的位置保持一段时间后反而不会受限。这一现象是否提示不同下颌位置对关节或肌肉功能存在影响？目前是否应按「功能更好」的位置调整咬合，还是建议先观察？治疗上应优先关节功能恢复、肌肉康复，还是进一步评估咬合？</w:t>
+        <w:t>牙齿对得比较舒服的咬合位保持一段时间后容易张口受限；而左前牙（2或3）先接触的位置保持一段时间后反而不会受限，但保持一会就会出现左侧太阳穴紧绷。这一现象是否提示不同下颌位置对关节或肌肉功能存在影响？目前是否应按「功能更好」的位置调整咬合，还是建议先观察？治疗上应优先关节功能恢复、肌肉康复，还是进一步评估咬合？</w:t>
       </w:r>
     </w:p>
     <w:p>

</xml_diff>

<commit_message>
Remove temple tightness note for anterior contact hold
Drop the phrase about left temple tightness when holding the left anterior contact position.

Co-authored-by: cnlyj6 <cnlyj6@users.noreply.github.com>
</commit_message>
<xml_diff>
--- a/medical_history/medical_history.docx
+++ b/medical_history/medical_history.docx
@@ -378,7 +378,7 @@
           <w:b/>
           <w:sz w:val="22"/>
         </w:rPr>
-        <w:t>而左前牙（2或者3）先接触的位置保持一段时间后，反而不会张口受限；但是这种位置保持一会就会出现左侧太阳穴紧绷。</w:t>
+        <w:t>而左前牙（2或者3）先接触的位置保持一段时间后，反而不会张口受限。</w:t>
       </w:r>
     </w:p>
     <w:p>
@@ -648,7 +648,7 @@
           <w:b w:val="0"/>
           <w:sz w:val="22"/>
         </w:rPr>
-        <w:t>牙齿对得比较舒服的咬合位保持一段时间后容易张口受限；而左前牙（2或3）先接触的位置保持一段时间后反而不会受限，但保持一会就会出现左侧太阳穴紧绷。这一现象是否提示不同下颌位置对关节或肌肉功能存在影响？目前是否应按「功能更好」的位置调整咬合，还是建议先观察？治疗上应优先关节功能恢复、肌肉康复，还是进一步评估咬合？</w:t>
+        <w:t>牙齿对得比较舒服的咬合位保持一段时间后容易张口受限；而左前牙（2或3）先接触的位置保持一段时间后反而不会受限。这一现象是否提示不同下颌位置对关节或肌肉功能存在影响？目前是否应按「功能更好」的位置调整咬合，还是建议先观察？治疗上应优先关节功能恢复、肌肉康复，还是进一步评估咬合？</w:t>
       </w:r>
     </w:p>
     <w:p>

</xml_diff>

<commit_message>
Revert pain section to the original wording
Restore the previous combined description of temple, facial, neck, and ear pain.

Co-authored-by: cnlyj6 <cnlyj6@users.noreply.github.com>
</commit_message>
<xml_diff>
--- a/medical_history/medical_history.docx
+++ b/medical_history/medical_history.docx
@@ -474,21 +474,7 @@
           <w:b w:val="0"/>
           <w:sz w:val="22"/>
         </w:rPr>
-        <w:t>左侧太阳穴紧绷几乎每天都有</w:t>
-      </w:r>
-    </w:p>
-    <w:p>
-      <w:pPr>
-        <w:pStyle w:val="ListBullet"/>
-        <w:spacing w:lineRule="auto" w:line="324" w:after="80" w:before="0"/>
-      </w:pPr>
-      <w:r>
-        <w:rPr>
-          <w:rFonts w:ascii="微软雅黑" w:hAnsi="微软雅黑" w:eastAsia="微软雅黑"/>
-          <w:b w:val="0"/>
-          <w:sz w:val="22"/>
-        </w:rPr>
-        <w:t>另多次出现左侧面部痛、左侧脖子痛、左耳周及耳朵里面痛</w:t>
+        <w:t>发病后多次出现太阳穴紧绷、面部痛、脖子痛、耳周耳朵里面痛</w:t>
       </w:r>
     </w:p>
     <w:p>

</xml_diff>

<commit_message>
Update medical history: add symptoms and questions
- Fixed '受限期间没有左前牙先接触了' wording
- Added '有时候吃饭左侧脸会感觉累' to bite/jaw section
- Added '太阳穴经常感觉绷着' to symptoms
- Simplified questions section with 3 key questions
- Combined '补了左下6、7号牙' with following sentence
- Synced all 4 files (txt, html, md, docx)

Co-authored-by: cnlyj6 <cnlyj6@users.noreply.github.com>
</commit_message>
<xml_diff>
--- a/medical_history/medical_history.docx
+++ b/medical_history/medical_history.docx
@@ -46,7 +46,7 @@
         <w:pStyle w:val="Compact"/>
       </w:pPr>
       <w:r>
-        <w:t xml:space="preserve">补了左下6、7号牙</w:t>
+        <w:t xml:space="preserve">补了左下6、7号牙，</w:t>
       </w:r>
     </w:p>
     <w:p>
@@ -196,7 +196,7 @@
         <w:pStyle w:val="Compact"/>
       </w:pPr>
       <w:r>
-        <w:t xml:space="preserve">弹响次数减少，出现张口受限约2指，张口轨迹偏斜，用手托住两侧脸张嘴偏斜消失，受限期间好像没感觉左前牙先接触了，导致我去看医生都忘记说了</w:t>
+        <w:t xml:space="preserve">弹响次数减少，出现张口受限约2指，张口轨迹偏斜，用手托住两侧脸张嘴偏斜消失，受限期间没有左前牙先接触了</w:t>
       </w:r>
     </w:p>
     <w:p>
@@ -271,7 +271,7 @@
         <w:pStyle w:val="Compact"/>
       </w:pPr>
       <w:r>
-        <w:t xml:space="preserve">左侧经常感觉有一块区域无法充分接触，像空出来一块。</w:t>
+        <w:t xml:space="preserve">左侧经常感觉有一块区域无法充分接触，像空出来一块，太阳穴经常感觉绷着。有时候吃饭左侧脸会感觉累。</w:t>
       </w:r>
     </w:p>
     <w:bookmarkEnd w:id="25"/>
@@ -472,13 +472,13 @@
           <w:bCs/>
           <w:b/>
         </w:rPr>
-        <w:t xml:space="preserve">目前症状的主要影响因素是什么？</w:t>
+        <w:t xml:space="preserve">关节问题出现和咬合改变是否有关系？</w:t>
       </w:r>
       <w:r>
         <w:t xml:space="preserve"> </w:t>
       </w:r>
       <w:r>
-        <w:t xml:space="preserve">希望评估以下因素中，哪一项占主要作用：关节盘位置及关节结构变化、咀嚼肌功能及肌肉紧张、咬合接触变化或功能性干扰</w:t>
+        <w:t xml:space="preserve">咬合不稳不适对于关节恢复是否有影响？有没有办法恢复到我之前的咬合状态？</w:t>
       </w:r>
     </w:p>
     <w:p>
@@ -493,13 +493,13 @@
           <w:bCs/>
           <w:b/>
         </w:rPr>
-        <w:t xml:space="preserve">补牙及后续调磨后的咬合变化是否影响了下颌运动？</w:t>
+        <w:t xml:space="preserve"/>
       </w:r>
       <w:r>
         <w:t xml:space="preserve"> </w:t>
       </w:r>
       <w:r>
-        <w:t xml:space="preserve">特别是左下6号牙调磨后，是否可能导致：后牙支撑变化、下颌闭合轨迹改变、前牙异常接触</w:t>
+        <w:t xml:space="preserve"/>
       </w:r>
     </w:p>
     <w:p>
@@ -514,7 +514,7 @@
           <w:bCs/>
           <w:b/>
         </w:rPr>
-        <w:t xml:space="preserve">关于治疗方向和咬合调整的判断：</w:t>
+        <w:t xml:space="preserve"/>
       </w:r>
     </w:p>
     <w:p>
@@ -526,7 +526,7 @@
         <w:pStyle w:val="Compact"/>
       </w:pPr>
       <w:r>
-        <w:t xml:space="preserve">不同咬合位置持续一段时间后，会出现不同程度的张口受限，这种现象是否提示不同下颌位置对关节或肌肉功能存在影响？</w:t>
+        <w:t xml:space="preserve"/>
       </w:r>
     </w:p>
     <w:p>
@@ -538,7 +538,7 @@
         <w:pStyle w:val="Compact"/>
       </w:pPr>
       <w:r>
-        <w:t xml:space="preserve">目前是否应该优先进行关节功能恢复、肌肉康复，还是进一步评估咬合？</w:t>
+        <w:t xml:space="preserve"/>
       </w:r>
     </w:p>
     <w:p>
@@ -550,7 +550,7 @@
         <w:pStyle w:val="Compact"/>
       </w:pPr>
       <w:r>
-        <w:t xml:space="preserve">如果某个牙齿接触感觉不理想，但下颌功能反而更好，是否需要调整咬合，还是建议先观察？</w:t>
+        <w:t xml:space="preserve"/>
       </w:r>
     </w:p>
     <w:bookmarkEnd w:id="31"/>

</xml_diff>